<commit_message>
fix(phase-1): correct fn_deal_row_version trigger (gen_random_uuid instead of gen_random_bytes); docs(phase-1): regen implemented-modules (Deals+Pipelines now Full); graphify refresh
- Migration 20260516000001: updated comment + SQL to use decode(replace(gen_random_uuid()::text,'-',''),'hex')
  gen_random_bytes(16) requires pgcrypto extension which is not installed by default.
  gen_random_uuid() is built-in since PG13 and produces 16 CSPRNG bytes.
- Migration 20260516000002_FixDealRowVersionTrigger: corrective migration applied to live DB.
- docs: crmRows updated — Deals (Full), Pipelines (Full) added; Pipeline frontend-only stub removed.
- graphify: updated (3521 nodes, 4843 edges, 450 communities) — skipped staging (gitignored).

Co-Authored-By: Claude Sonnet 4.6 <noreply@anthropic.com>
</commit_message>
<xml_diff>
--- a/docs/implemented-modules.docx
+++ b/docs/implemented-modules.docx
@@ -47,7 +47,7 @@
           <w:sz w:val="22"/>
           <w:szCs w:val="22"/>
         </w:rPr>
-        <w:t xml:space="preserve">As of 2026-05-12</w:t>
+        <w:t xml:space="preserve">As of 2026-05-15</w:t>
       </w:r>
     </w:p>
     <w:p>
@@ -3160,7 +3160,7 @@
           <w:sz w:val="21"/>
           <w:szCs w:val="21"/>
         </w:rPr>
-        <w:t xml:space="preserve">Customer-facing business modules. Four are full-stack; seven are frontend-only stubs awaiting backend implementation.</w:t>
+        <w:t xml:space="preserve">Customer-facing business modules. Six are full-stack (Leads, Deals, Pipelines, Tasks, Time Entries, Reminders); six are frontend-only stubs awaiting Phase 2+ backend implementation.</w:t>
       </w:r>
     </w:p>
     <w:tbl>
@@ -3439,59 +3439,59 @@
                 <w:sz w:val="20"/>
                 <w:szCs w:val="20"/>
               </w:rPr>
-              <w:t xml:space="preserve">Tasks (CRM)</w:t>
-            </w:r>
-          </w:p>
-        </w:tc>
-        <w:tc>
-          <w:tcPr>
-            <w:tcW w:type="dxa" w:w="3000"/>
-            <w:tcBorders>
-              <w:top w:val="single" w:color="CCCCCC" w:sz="4"/>
-              <w:left w:val="single" w:color="CCCCCC" w:sz="4"/>
-              <w:bottom w:val="single" w:color="CCCCCC" w:sz="4"/>
-              <w:right w:val="single" w:color="CCCCCC" w:sz="4"/>
-            </w:tcBorders>
-            <w:tcMar>
-              <w:top w:type="dxa" w:w="100"/>
-              <w:left w:type="dxa" w:w="140"/>
-              <w:bottom w:type="dxa" w:w="100"/>
-              <w:right w:type="dxa" w:w="140"/>
-            </w:tcMar>
-          </w:tcPr>
-          <w:p>
-            <w:r>
-              <w:rPr>
-                <w:sz w:val="20"/>
-                <w:szCs w:val="20"/>
-              </w:rPr>
-              <w:t xml:space="preserve">Features/Tasks + TasksController</w:t>
-            </w:r>
-          </w:p>
-        </w:tc>
-        <w:tc>
-          <w:tcPr>
-            <w:tcW w:type="dxa" w:w="3000"/>
-            <w:tcBorders>
-              <w:top w:val="single" w:color="CCCCCC" w:sz="4"/>
-              <w:left w:val="single" w:color="CCCCCC" w:sz="4"/>
-              <w:bottom w:val="single" w:color="CCCCCC" w:sz="4"/>
-              <w:right w:val="single" w:color="CCCCCC" w:sz="4"/>
-            </w:tcBorders>
-            <w:tcMar>
-              <w:top w:type="dxa" w:w="100"/>
-              <w:left w:type="dxa" w:w="140"/>
-              <w:bottom w:type="dxa" w:w="100"/>
-              <w:right w:type="dxa" w:w="140"/>
-            </w:tcMar>
-          </w:tcPr>
-          <w:p>
-            <w:r>
-              <w:rPr>
-                <w:sz w:val="20"/>
-                <w:szCs w:val="20"/>
-              </w:rPr>
-              <w:t xml:space="preserve">apps/task/ (list, form, detail, kanban)</w:t>
+              <w:t xml:space="preserve">Deals</w:t>
+            </w:r>
+          </w:p>
+        </w:tc>
+        <w:tc>
+          <w:tcPr>
+            <w:tcW w:type="dxa" w:w="3000"/>
+            <w:tcBorders>
+              <w:top w:val="single" w:color="CCCCCC" w:sz="4"/>
+              <w:left w:val="single" w:color="CCCCCC" w:sz="4"/>
+              <w:bottom w:val="single" w:color="CCCCCC" w:sz="4"/>
+              <w:right w:val="single" w:color="CCCCCC" w:sz="4"/>
+            </w:tcBorders>
+            <w:tcMar>
+              <w:top w:type="dxa" w:w="100"/>
+              <w:left w:type="dxa" w:w="140"/>
+              <w:bottom w:type="dxa" w:w="100"/>
+              <w:right w:type="dxa" w:w="140"/>
+            </w:tcMar>
+          </w:tcPr>
+          <w:p>
+            <w:r>
+              <w:rPr>
+                <w:sz w:val="20"/>
+                <w:szCs w:val="20"/>
+              </w:rPr>
+              <w:t xml:space="preserve">Features/Crm/Deals + DealsController (9 endpoints)</w:t>
+            </w:r>
+          </w:p>
+        </w:tc>
+        <w:tc>
+          <w:tcPr>
+            <w:tcW w:type="dxa" w:w="3000"/>
+            <w:tcBorders>
+              <w:top w:val="single" w:color="CCCCCC" w:sz="4"/>
+              <w:left w:val="single" w:color="CCCCCC" w:sz="4"/>
+              <w:bottom w:val="single" w:color="CCCCCC" w:sz="4"/>
+              <w:right w:val="single" w:color="CCCCCC" w:sz="4"/>
+            </w:tcBorders>
+            <w:tcMar>
+              <w:top w:type="dxa" w:w="100"/>
+              <w:left w:type="dxa" w:w="140"/>
+              <w:bottom w:type="dxa" w:w="100"/>
+              <w:right w:type="dxa" w:w="140"/>
+            </w:tcMar>
+          </w:tcPr>
+          <w:p>
+            <w:r>
+              <w:rPr>
+                <w:sz w:val="20"/>
+                <w:szCs w:val="20"/>
+              </w:rPr>
+              <w:t xml:space="preserve">pages/crm/deals/ (list, kanban, detail)</w:t>
             </w:r>
           </w:p>
         </w:tc>
@@ -3549,59 +3549,59 @@
                 <w:sz w:val="20"/>
                 <w:szCs w:val="20"/>
               </w:rPr>
-              <w:t xml:space="preserve">Time Entries (per-task logging)</w:t>
-            </w:r>
-          </w:p>
-        </w:tc>
-        <w:tc>
-          <w:tcPr>
-            <w:tcW w:type="dxa" w:w="3000"/>
-            <w:tcBorders>
-              <w:top w:val="single" w:color="CCCCCC" w:sz="4"/>
-              <w:left w:val="single" w:color="CCCCCC" w:sz="4"/>
-              <w:bottom w:val="single" w:color="CCCCCC" w:sz="4"/>
-              <w:right w:val="single" w:color="CCCCCC" w:sz="4"/>
-            </w:tcBorders>
-            <w:tcMar>
-              <w:top w:type="dxa" w:w="100"/>
-              <w:left w:type="dxa" w:w="140"/>
-              <w:bottom w:type="dxa" w:w="100"/>
-              <w:right w:type="dxa" w:w="140"/>
-            </w:tcMar>
-          </w:tcPr>
-          <w:p>
-            <w:r>
-              <w:rPr>
-                <w:sz w:val="20"/>
-                <w:szCs w:val="20"/>
-              </w:rPr>
-              <w:t xml:space="preserve">Features/TimeEntries + TimeEntriesController</w:t>
-            </w:r>
-          </w:p>
-        </w:tc>
-        <w:tc>
-          <w:tcPr>
-            <w:tcW w:type="dxa" w:w="3000"/>
-            <w:tcBorders>
-              <w:top w:val="single" w:color="CCCCCC" w:sz="4"/>
-              <w:left w:val="single" w:color="CCCCCC" w:sz="4"/>
-              <w:bottom w:val="single" w:color="CCCCCC" w:sz="4"/>
-              <w:right w:val="single" w:color="CCCCCC" w:sz="4"/>
-            </w:tcBorders>
-            <w:tcMar>
-              <w:top w:type="dxa" w:w="100"/>
-              <w:left w:type="dxa" w:w="140"/>
-              <w:bottom w:type="dxa" w:w="100"/>
-              <w:right w:type="dxa" w:w="140"/>
-            </w:tcMar>
-          </w:tcPr>
-          <w:p>
-            <w:r>
-              <w:rPr>
-                <w:sz w:val="20"/>
-                <w:szCs w:val="20"/>
-              </w:rPr>
-              <w:t xml:space="preserve">embedded in task detail page</w:t>
+              <w:t xml:space="preserve">Pipelines (configurable stages)</w:t>
+            </w:r>
+          </w:p>
+        </w:tc>
+        <w:tc>
+          <w:tcPr>
+            <w:tcW w:type="dxa" w:w="3000"/>
+            <w:tcBorders>
+              <w:top w:val="single" w:color="CCCCCC" w:sz="4"/>
+              <w:left w:val="single" w:color="CCCCCC" w:sz="4"/>
+              <w:bottom w:val="single" w:color="CCCCCC" w:sz="4"/>
+              <w:right w:val="single" w:color="CCCCCC" w:sz="4"/>
+            </w:tcBorders>
+            <w:tcMar>
+              <w:top w:type="dxa" w:w="100"/>
+              <w:left w:type="dxa" w:w="140"/>
+              <w:bottom w:type="dxa" w:w="100"/>
+              <w:right w:type="dxa" w:w="140"/>
+            </w:tcMar>
+          </w:tcPr>
+          <w:p>
+            <w:r>
+              <w:rPr>
+                <w:sz w:val="20"/>
+                <w:szCs w:val="20"/>
+              </w:rPr>
+              <w:t xml:space="preserve">Features/Crm/Pipelines + PipelinesController (9 endpoints)</w:t>
+            </w:r>
+          </w:p>
+        </w:tc>
+        <w:tc>
+          <w:tcPr>
+            <w:tcW w:type="dxa" w:w="3000"/>
+            <w:tcBorders>
+              <w:top w:val="single" w:color="CCCCCC" w:sz="4"/>
+              <w:left w:val="single" w:color="CCCCCC" w:sz="4"/>
+              <w:bottom w:val="single" w:color="CCCCCC" w:sz="4"/>
+              <w:right w:val="single" w:color="CCCCCC" w:sz="4"/>
+            </w:tcBorders>
+            <w:tcMar>
+              <w:top w:type="dxa" w:w="100"/>
+              <w:left w:type="dxa" w:w="140"/>
+              <w:bottom w:type="dxa" w:w="100"/>
+              <w:right w:type="dxa" w:w="140"/>
+            </w:tcMar>
+          </w:tcPr>
+          <w:p>
+            <w:r>
+              <w:rPr>
+                <w:sz w:val="20"/>
+                <w:szCs w:val="20"/>
+              </w:rPr>
+              <w:t xml:space="preserve">pages/crm/pipelines/ (list + drag-drop edit)</w:t>
             </w:r>
           </w:p>
         </w:tc>
@@ -3659,59 +3659,59 @@
                 <w:sz w:val="20"/>
                 <w:szCs w:val="20"/>
               </w:rPr>
-              <w:t xml:space="preserve">Reminders</w:t>
-            </w:r>
-          </w:p>
-        </w:tc>
-        <w:tc>
-          <w:tcPr>
-            <w:tcW w:type="dxa" w:w="3000"/>
-            <w:tcBorders>
-              <w:top w:val="single" w:color="CCCCCC" w:sz="4"/>
-              <w:left w:val="single" w:color="CCCCCC" w:sz="4"/>
-              <w:bottom w:val="single" w:color="CCCCCC" w:sz="4"/>
-              <w:right w:val="single" w:color="CCCCCC" w:sz="4"/>
-            </w:tcBorders>
-            <w:tcMar>
-              <w:top w:type="dxa" w:w="100"/>
-              <w:left w:type="dxa" w:w="140"/>
-              <w:bottom w:type="dxa" w:w="100"/>
-              <w:right w:type="dxa" w:w="140"/>
-            </w:tcMar>
-          </w:tcPr>
-          <w:p>
-            <w:r>
-              <w:rPr>
-                <w:sz w:val="20"/>
-                <w:szCs w:val="20"/>
-              </w:rPr>
-              <w:t xml:space="preserve">Features/Reminders + RemindersController</w:t>
-            </w:r>
-          </w:p>
-        </w:tc>
-        <w:tc>
-          <w:tcPr>
-            <w:tcW w:type="dxa" w:w="3000"/>
-            <w:tcBorders>
-              <w:top w:val="single" w:color="CCCCCC" w:sz="4"/>
-              <w:left w:val="single" w:color="CCCCCC" w:sz="4"/>
-              <w:bottom w:val="single" w:color="CCCCCC" w:sz="4"/>
-              <w:right w:val="single" w:color="CCCCCC" w:sz="4"/>
-            </w:tcBorders>
-            <w:tcMar>
-              <w:top w:type="dxa" w:w="100"/>
-              <w:left w:type="dxa" w:w="140"/>
-              <w:bottom w:type="dxa" w:w="100"/>
-              <w:right w:type="dxa" w:w="140"/>
-            </w:tcMar>
-          </w:tcPr>
-          <w:p>
-            <w:r>
-              <w:rPr>
-                <w:sz w:val="20"/>
-                <w:szCs w:val="20"/>
-              </w:rPr>
-              <w:t xml:space="preserve">pages/reminders/</w:t>
+              <w:t xml:space="preserve">Tasks (CRM)</w:t>
+            </w:r>
+          </w:p>
+        </w:tc>
+        <w:tc>
+          <w:tcPr>
+            <w:tcW w:type="dxa" w:w="3000"/>
+            <w:tcBorders>
+              <w:top w:val="single" w:color="CCCCCC" w:sz="4"/>
+              <w:left w:val="single" w:color="CCCCCC" w:sz="4"/>
+              <w:bottom w:val="single" w:color="CCCCCC" w:sz="4"/>
+              <w:right w:val="single" w:color="CCCCCC" w:sz="4"/>
+            </w:tcBorders>
+            <w:tcMar>
+              <w:top w:type="dxa" w:w="100"/>
+              <w:left w:type="dxa" w:w="140"/>
+              <w:bottom w:type="dxa" w:w="100"/>
+              <w:right w:type="dxa" w:w="140"/>
+            </w:tcMar>
+          </w:tcPr>
+          <w:p>
+            <w:r>
+              <w:rPr>
+                <w:sz w:val="20"/>
+                <w:szCs w:val="20"/>
+              </w:rPr>
+              <w:t xml:space="preserve">Features/Tasks + TasksController</w:t>
+            </w:r>
+          </w:p>
+        </w:tc>
+        <w:tc>
+          <w:tcPr>
+            <w:tcW w:type="dxa" w:w="3000"/>
+            <w:tcBorders>
+              <w:top w:val="single" w:color="CCCCCC" w:sz="4"/>
+              <w:left w:val="single" w:color="CCCCCC" w:sz="4"/>
+              <w:bottom w:val="single" w:color="CCCCCC" w:sz="4"/>
+              <w:right w:val="single" w:color="CCCCCC" w:sz="4"/>
+            </w:tcBorders>
+            <w:tcMar>
+              <w:top w:type="dxa" w:w="100"/>
+              <w:left w:type="dxa" w:w="140"/>
+              <w:bottom w:type="dxa" w:w="100"/>
+              <w:right w:type="dxa" w:w="140"/>
+            </w:tcMar>
+          </w:tcPr>
+          <w:p>
+            <w:r>
+              <w:rPr>
+                <w:sz w:val="20"/>
+                <w:szCs w:val="20"/>
+              </w:rPr>
+              <w:t xml:space="preserve">apps/task/</w:t>
             </w:r>
           </w:p>
         </w:tc>
@@ -3769,6 +3769,226 @@
                 <w:sz w:val="20"/>
                 <w:szCs w:val="20"/>
               </w:rPr>
+              <w:t xml:space="preserve">Time Entries</w:t>
+            </w:r>
+          </w:p>
+        </w:tc>
+        <w:tc>
+          <w:tcPr>
+            <w:tcW w:type="dxa" w:w="3000"/>
+            <w:tcBorders>
+              <w:top w:val="single" w:color="CCCCCC" w:sz="4"/>
+              <w:left w:val="single" w:color="CCCCCC" w:sz="4"/>
+              <w:bottom w:val="single" w:color="CCCCCC" w:sz="4"/>
+              <w:right w:val="single" w:color="CCCCCC" w:sz="4"/>
+            </w:tcBorders>
+            <w:tcMar>
+              <w:top w:type="dxa" w:w="100"/>
+              <w:left w:type="dxa" w:w="140"/>
+              <w:bottom w:type="dxa" w:w="100"/>
+              <w:right w:type="dxa" w:w="140"/>
+            </w:tcMar>
+          </w:tcPr>
+          <w:p>
+            <w:r>
+              <w:rPr>
+                <w:sz w:val="20"/>
+                <w:szCs w:val="20"/>
+              </w:rPr>
+              <w:t xml:space="preserve">Features/TimeEntries + TimeEntriesController</w:t>
+            </w:r>
+          </w:p>
+        </w:tc>
+        <w:tc>
+          <w:tcPr>
+            <w:tcW w:type="dxa" w:w="3000"/>
+            <w:tcBorders>
+              <w:top w:val="single" w:color="CCCCCC" w:sz="4"/>
+              <w:left w:val="single" w:color="CCCCCC" w:sz="4"/>
+              <w:bottom w:val="single" w:color="CCCCCC" w:sz="4"/>
+              <w:right w:val="single" w:color="CCCCCC" w:sz="4"/>
+            </w:tcBorders>
+            <w:tcMar>
+              <w:top w:type="dxa" w:w="100"/>
+              <w:left w:type="dxa" w:w="140"/>
+              <w:bottom w:type="dxa" w:w="100"/>
+              <w:right w:type="dxa" w:w="140"/>
+            </w:tcMar>
+          </w:tcPr>
+          <w:p>
+            <w:r>
+              <w:rPr>
+                <w:sz w:val="20"/>
+                <w:szCs w:val="20"/>
+              </w:rPr>
+              <w:t xml:space="preserve">embedded in task detail</w:t>
+            </w:r>
+          </w:p>
+        </w:tc>
+        <w:tc>
+          <w:tcPr>
+            <w:tcW w:type="dxa" w:w="1380"/>
+            <w:tcBorders>
+              <w:top w:val="single" w:color="CCCCCC" w:sz="4"/>
+              <w:left w:val="single" w:color="CCCCCC" w:sz="4"/>
+              <w:bottom w:val="single" w:color="CCCCCC" w:sz="4"/>
+              <w:right w:val="single" w:color="CCCCCC" w:sz="4"/>
+            </w:tcBorders>
+            <w:shd w:fill="D4F4DD" w:color="auto" w:val="clear"/>
+            <w:tcMar>
+              <w:top w:type="dxa" w:w="100"/>
+              <w:left w:type="dxa" w:w="140"/>
+              <w:bottom w:type="dxa" w:w="100"/>
+              <w:right w:type="dxa" w:w="140"/>
+            </w:tcMar>
+          </w:tcPr>
+          <w:p>
+            <w:r>
+              <w:rPr>
+                <w:b/>
+                <w:bCs/>
+                <w:color w:val="14532D"/>
+                <w:sz w:val="20"/>
+                <w:szCs w:val="20"/>
+              </w:rPr>
+              <w:t xml:space="preserve">Full</w:t>
+            </w:r>
+          </w:p>
+        </w:tc>
+      </w:tr>
+      <w:tr>
+        <w:tc>
+          <w:tcPr>
+            <w:tcW w:type="dxa" w:w="2700"/>
+            <w:tcBorders>
+              <w:top w:val="single" w:color="CCCCCC" w:sz="4"/>
+              <w:left w:val="single" w:color="CCCCCC" w:sz="4"/>
+              <w:bottom w:val="single" w:color="CCCCCC" w:sz="4"/>
+              <w:right w:val="single" w:color="CCCCCC" w:sz="4"/>
+            </w:tcBorders>
+            <w:tcMar>
+              <w:top w:type="dxa" w:w="100"/>
+              <w:left w:type="dxa" w:w="140"/>
+              <w:bottom w:type="dxa" w:w="100"/>
+              <w:right w:type="dxa" w:w="140"/>
+            </w:tcMar>
+          </w:tcPr>
+          <w:p>
+            <w:r>
+              <w:rPr>
+                <w:sz w:val="20"/>
+                <w:szCs w:val="20"/>
+              </w:rPr>
+              <w:t xml:space="preserve">Reminders</w:t>
+            </w:r>
+          </w:p>
+        </w:tc>
+        <w:tc>
+          <w:tcPr>
+            <w:tcW w:type="dxa" w:w="3000"/>
+            <w:tcBorders>
+              <w:top w:val="single" w:color="CCCCCC" w:sz="4"/>
+              <w:left w:val="single" w:color="CCCCCC" w:sz="4"/>
+              <w:bottom w:val="single" w:color="CCCCCC" w:sz="4"/>
+              <w:right w:val="single" w:color="CCCCCC" w:sz="4"/>
+            </w:tcBorders>
+            <w:tcMar>
+              <w:top w:type="dxa" w:w="100"/>
+              <w:left w:type="dxa" w:w="140"/>
+              <w:bottom w:type="dxa" w:w="100"/>
+              <w:right w:type="dxa" w:w="140"/>
+            </w:tcMar>
+          </w:tcPr>
+          <w:p>
+            <w:r>
+              <w:rPr>
+                <w:sz w:val="20"/>
+                <w:szCs w:val="20"/>
+              </w:rPr>
+              <w:t xml:space="preserve">Features/Reminders + RemindersController</w:t>
+            </w:r>
+          </w:p>
+        </w:tc>
+        <w:tc>
+          <w:tcPr>
+            <w:tcW w:type="dxa" w:w="3000"/>
+            <w:tcBorders>
+              <w:top w:val="single" w:color="CCCCCC" w:sz="4"/>
+              <w:left w:val="single" w:color="CCCCCC" w:sz="4"/>
+              <w:bottom w:val="single" w:color="CCCCCC" w:sz="4"/>
+              <w:right w:val="single" w:color="CCCCCC" w:sz="4"/>
+            </w:tcBorders>
+            <w:tcMar>
+              <w:top w:type="dxa" w:w="100"/>
+              <w:left w:type="dxa" w:w="140"/>
+              <w:bottom w:type="dxa" w:w="100"/>
+              <w:right w:type="dxa" w:w="140"/>
+            </w:tcMar>
+          </w:tcPr>
+          <w:p>
+            <w:r>
+              <w:rPr>
+                <w:sz w:val="20"/>
+                <w:szCs w:val="20"/>
+              </w:rPr>
+              <w:t xml:space="preserve">pages/reminders/</w:t>
+            </w:r>
+          </w:p>
+        </w:tc>
+        <w:tc>
+          <w:tcPr>
+            <w:tcW w:type="dxa" w:w="1380"/>
+            <w:tcBorders>
+              <w:top w:val="single" w:color="CCCCCC" w:sz="4"/>
+              <w:left w:val="single" w:color="CCCCCC" w:sz="4"/>
+              <w:bottom w:val="single" w:color="CCCCCC" w:sz="4"/>
+              <w:right w:val="single" w:color="CCCCCC" w:sz="4"/>
+            </w:tcBorders>
+            <w:shd w:fill="D4F4DD" w:color="auto" w:val="clear"/>
+            <w:tcMar>
+              <w:top w:type="dxa" w:w="100"/>
+              <w:left w:type="dxa" w:w="140"/>
+              <w:bottom w:type="dxa" w:w="100"/>
+              <w:right w:type="dxa" w:w="140"/>
+            </w:tcMar>
+          </w:tcPr>
+          <w:p>
+            <w:r>
+              <w:rPr>
+                <w:b/>
+                <w:bCs/>
+                <w:color w:val="14532D"/>
+                <w:sz w:val="20"/>
+                <w:szCs w:val="20"/>
+              </w:rPr>
+              <w:t xml:space="preserve">Full</w:t>
+            </w:r>
+          </w:p>
+        </w:tc>
+      </w:tr>
+      <w:tr>
+        <w:tc>
+          <w:tcPr>
+            <w:tcW w:type="dxa" w:w="2700"/>
+            <w:tcBorders>
+              <w:top w:val="single" w:color="CCCCCC" w:sz="4"/>
+              <w:left w:val="single" w:color="CCCCCC" w:sz="4"/>
+              <w:bottom w:val="single" w:color="CCCCCC" w:sz="4"/>
+              <w:right w:val="single" w:color="CCCCCC" w:sz="4"/>
+            </w:tcBorders>
+            <w:tcMar>
+              <w:top w:type="dxa" w:w="100"/>
+              <w:left w:type="dxa" w:w="140"/>
+              <w:bottom w:type="dxa" w:w="100"/>
+              <w:right w:type="dxa" w:w="140"/>
+            </w:tcMar>
+          </w:tcPr>
+          <w:p>
+            <w:r>
+              <w:rPr>
+                <w:sz w:val="20"/>
+                <w:szCs w:val="20"/>
+              </w:rPr>
               <w:t xml:space="preserve">Companies</w:t>
             </w:r>
           </w:p>
@@ -4262,116 +4482,6 @@
                 <w:szCs w:val="20"/>
               </w:rPr>
               <w:t xml:space="preserve">pages/crm/destinations/</w:t>
-            </w:r>
-          </w:p>
-        </w:tc>
-        <w:tc>
-          <w:tcPr>
-            <w:tcW w:type="dxa" w:w="1380"/>
-            <w:tcBorders>
-              <w:top w:val="single" w:color="CCCCCC" w:sz="4"/>
-              <w:left w:val="single" w:color="CCCCCC" w:sz="4"/>
-              <w:bottom w:val="single" w:color="CCCCCC" w:sz="4"/>
-              <w:right w:val="single" w:color="CCCCCC" w:sz="4"/>
-            </w:tcBorders>
-            <w:shd w:fill="FFE4E6" w:color="auto" w:val="clear"/>
-            <w:tcMar>
-              <w:top w:type="dxa" w:w="100"/>
-              <w:left w:type="dxa" w:w="140"/>
-              <w:bottom w:type="dxa" w:w="100"/>
-              <w:right w:type="dxa" w:w="140"/>
-            </w:tcMar>
-          </w:tcPr>
-          <w:p>
-            <w:r>
-              <w:rPr>
-                <w:b/>
-                <w:bCs/>
-                <w:color w:val="7F1D1D"/>
-                <w:sz w:val="20"/>
-                <w:szCs w:val="20"/>
-              </w:rPr>
-              <w:t xml:space="preserve">Frontend-only</w:t>
-            </w:r>
-          </w:p>
-        </w:tc>
-      </w:tr>
-      <w:tr>
-        <w:tc>
-          <w:tcPr>
-            <w:tcW w:type="dxa" w:w="2700"/>
-            <w:tcBorders>
-              <w:top w:val="single" w:color="CCCCCC" w:sz="4"/>
-              <w:left w:val="single" w:color="CCCCCC" w:sz="4"/>
-              <w:bottom w:val="single" w:color="CCCCCC" w:sz="4"/>
-              <w:right w:val="single" w:color="CCCCCC" w:sz="4"/>
-            </w:tcBorders>
-            <w:tcMar>
-              <w:top w:type="dxa" w:w="100"/>
-              <w:left w:type="dxa" w:w="140"/>
-              <w:bottom w:type="dxa" w:w="100"/>
-              <w:right w:type="dxa" w:w="140"/>
-            </w:tcMar>
-          </w:tcPr>
-          <w:p>
-            <w:r>
-              <w:rPr>
-                <w:sz w:val="20"/>
-                <w:szCs w:val="20"/>
-              </w:rPr>
-              <w:t xml:space="preserve">Pipeline (sales)</w:t>
-            </w:r>
-          </w:p>
-        </w:tc>
-        <w:tc>
-          <w:tcPr>
-            <w:tcW w:type="dxa" w:w="3000"/>
-            <w:tcBorders>
-              <w:top w:val="single" w:color="CCCCCC" w:sz="4"/>
-              <w:left w:val="single" w:color="CCCCCC" w:sz="4"/>
-              <w:bottom w:val="single" w:color="CCCCCC" w:sz="4"/>
-              <w:right w:val="single" w:color="CCCCCC" w:sz="4"/>
-            </w:tcBorders>
-            <w:tcMar>
-              <w:top w:type="dxa" w:w="100"/>
-              <w:left w:type="dxa" w:w="140"/>
-              <w:bottom w:type="dxa" w:w="100"/>
-              <w:right w:type="dxa" w:w="140"/>
-            </w:tcMar>
-          </w:tcPr>
-          <w:p>
-            <w:r>
-              <w:rPr>
-                <w:sz w:val="20"/>
-                <w:szCs w:val="20"/>
-              </w:rPr>
-              <w:t xml:space="preserve">—</w:t>
-            </w:r>
-          </w:p>
-        </w:tc>
-        <w:tc>
-          <w:tcPr>
-            <w:tcW w:type="dxa" w:w="3000"/>
-            <w:tcBorders>
-              <w:top w:val="single" w:color="CCCCCC" w:sz="4"/>
-              <w:left w:val="single" w:color="CCCCCC" w:sz="4"/>
-              <w:bottom w:val="single" w:color="CCCCCC" w:sz="4"/>
-              <w:right w:val="single" w:color="CCCCCC" w:sz="4"/>
-            </w:tcBorders>
-            <w:tcMar>
-              <w:top w:type="dxa" w:w="100"/>
-              <w:left w:type="dxa" w:w="140"/>
-              <w:bottom w:type="dxa" w:w="100"/>
-              <w:right w:type="dxa" w:w="140"/>
-            </w:tcMar>
-          </w:tcPr>
-          <w:p>
-            <w:r>
-              <w:rPr>
-                <w:sz w:val="20"/>
-                <w:szCs w:val="20"/>
-              </w:rPr>
-              <w:t xml:space="preserve">pages/crm/pipeline/</w:t>
             </w:r>
           </w:p>
         </w:tc>
@@ -6526,7 +6636,7 @@
                 <w:sz w:val="20"/>
                 <w:szCs w:val="20"/>
               </w:rPr>
-              <w:t xml:space="preserve">~31</w:t>
+              <w:t xml:space="preserve">~33</w:t>
             </w:r>
           </w:p>
         </w:tc>
@@ -6634,7 +6744,7 @@
                 <w:sz w:val="20"/>
                 <w:szCs w:val="20"/>
               </w:rPr>
-              <w:t xml:space="preserve">7</w:t>
+              <w:t xml:space="preserve">6</w:t>
             </w:r>
           </w:p>
         </w:tc>
@@ -6660,7 +6770,7 @@
                 <w:sz w:val="20"/>
                 <w:szCs w:val="20"/>
               </w:rPr>
-              <w:t xml:space="preserve">CRM frontend stubs awaiting backends (Companies, Customers, Bookings, Packages, Destinations, Pipeline, Reports)</w:t>
+              <w:t xml:space="preserve">CRM frontend stubs awaiting backends (Companies, Customers, Bookings, Packages, Destinations, Reports)</w:t>
             </w:r>
           </w:p>
         </w:tc>
@@ -6742,7 +6852,7 @@
           <w:sz w:val="18"/>
           <w:szCs w:val="18"/>
         </w:rPr>
-        <w:t xml:space="preserve">Generated from src tree on 2026-05-12 — TravelCRMPlus internal documentation.</w:t>
+        <w:t xml:space="preserve">Generated from src tree on 2026-05-15 — TravelCRMPlus internal documentation.</w:t>
       </w:r>
     </w:p>
     <w:sectPr>

</xml_diff>